<commit_message>
docs(Elaboration - Iteration 1.2): added elaboration details in the corresponding document for P3 Deliverable
</commit_message>
<xml_diff>
--- a/docs/05 Project Lifecycle Documentation.docx
+++ b/docs/05 Project Lifecycle Documentation.docx
@@ -2056,7 +2056,7 @@
           <w:sz w:val="22"/>
           <w:szCs w:val="22"/>
         </w:rPr>
-        <w:t>Application Layer</w:t>
+        <w:t xml:space="preserve">Application Layer </w:t>
       </w:r>
       <w:r>
         <w:rPr>
@@ -2066,79 +2066,79 @@
           <w:sz w:val="22"/>
           <w:szCs w:val="22"/>
         </w:rPr>
-        <w:t xml:space="preserve"> </w:t>
-      </w:r>
-      <w:r>
-        <w:rPr>
-          <w:b/>
-          <w:bCs/>
+        <w:t>(Core Logic)</w:t>
+      </w:r>
+      <w:r>
+        <w:rPr>
           <w:color w:val="auto"/>
           <w:sz w:val="22"/>
           <w:szCs w:val="22"/>
         </w:rPr>
-        <w:t>(Core Logic)</w:t>
-      </w:r>
-      <w:r>
-        <w:rPr>
+        <w:t xml:space="preserve">, the "brain" of the system, where the </w:t>
+      </w:r>
+      <w:r>
+        <w:rPr>
+          <w:b/>
+          <w:bCs/>
           <w:color w:val="auto"/>
           <w:sz w:val="22"/>
           <w:szCs w:val="22"/>
         </w:rPr>
-        <w:t xml:space="preserve">, the "brain" of the system, where the </w:t>
-      </w:r>
-      <w:r>
-        <w:rPr>
-          <w:b/>
-          <w:bCs/>
+        <w:t xml:space="preserve">Pipeline </w:t>
+      </w:r>
+      <w:r>
+        <w:rPr>
           <w:color w:val="auto"/>
           <w:sz w:val="22"/>
           <w:szCs w:val="22"/>
         </w:rPr>
-        <w:t xml:space="preserve">Pipeline </w:t>
-      </w:r>
-      <w:r>
-        <w:rPr>
+        <w:t>and</w:t>
+      </w:r>
+      <w:r>
+        <w:rPr>
+          <w:b/>
+          <w:bCs/>
           <w:color w:val="auto"/>
           <w:sz w:val="22"/>
           <w:szCs w:val="22"/>
         </w:rPr>
-        <w:t>and</w:t>
-      </w:r>
-      <w:r>
-        <w:rPr>
-          <w:b/>
-          <w:bCs/>
+        <w:t xml:space="preserve"> Command patterns</w:t>
+      </w:r>
+      <w:r>
+        <w:rPr>
           <w:color w:val="auto"/>
           <w:sz w:val="22"/>
           <w:szCs w:val="22"/>
         </w:rPr>
-        <w:t xml:space="preserve"> Command patterns</w:t>
-      </w:r>
-      <w:r>
-        <w:rPr>
+        <w:t xml:space="preserve"> are implemented to transform raw messages into intelligent responses. Next is the </w:t>
+      </w:r>
+      <w:r>
+        <w:rPr>
+          <w:b/>
+          <w:bCs/>
           <w:color w:val="auto"/>
           <w:sz w:val="22"/>
           <w:szCs w:val="22"/>
         </w:rPr>
-        <w:t xml:space="preserve"> are implemented to transform raw messages into intelligent responses. Next is the </w:t>
-      </w:r>
-      <w:r>
-        <w:rPr>
-          <w:b/>
-          <w:bCs/>
+        <w:t>Infrastructure Layer</w:t>
+      </w:r>
+      <w:r>
+        <w:rPr>
           <w:color w:val="auto"/>
           <w:sz w:val="22"/>
           <w:szCs w:val="22"/>
         </w:rPr>
-        <w:t>Infrastructure Layer</w:t>
-      </w:r>
-      <w:r>
-        <w:rPr>
+        <w:t xml:space="preserve">, which isolates the business logic from the database details by using repository objects. The final level is the </w:t>
+      </w:r>
+      <w:r>
+        <w:rPr>
+          <w:b/>
+          <w:bCs/>
           <w:color w:val="auto"/>
           <w:sz w:val="22"/>
           <w:szCs w:val="22"/>
         </w:rPr>
-        <w:t xml:space="preserve">, which isolates the business logic from the database details by using repository objects. The final level is the </w:t>
+        <w:t>Data Storage</w:t>
       </w:r>
       <w:r>
         <w:rPr>
@@ -2148,25 +2148,107 @@
           <w:sz w:val="22"/>
           <w:szCs w:val="22"/>
         </w:rPr>
-        <w:t>Data Storage</w:t>
-      </w:r>
-      <w:r>
-        <w:rPr>
-          <w:b/>
-          <w:bCs/>
+        <w:t xml:space="preserve"> Layer</w:t>
+      </w:r>
+      <w:r>
+        <w:rPr>
           <w:color w:val="auto"/>
           <w:sz w:val="22"/>
           <w:szCs w:val="22"/>
         </w:rPr>
-        <w:t xml:space="preserve"> Layer</w:t>
-      </w:r>
-      <w:r>
+        <w:t>, representing the physical storage environment where session, message, and profile information is permanently saved.</w:t>
+      </w:r>
+    </w:p>
+    <w:p>
+      <w:pPr>
+        <w:pStyle w:val="Heading3"/>
+        <w:ind w:firstLine="720"/>
+        <w:jc w:val="both"/>
         <w:rPr>
           <w:color w:val="auto"/>
           <w:sz w:val="22"/>
           <w:szCs w:val="22"/>
         </w:rPr>
-        <w:t>, representing the physical storage environment where session, message, and profile information is permanently saved.</w:t>
+      </w:pPr>
+      <w:r>
+        <w:rPr>
+          <w:color w:val="auto"/>
+          <w:sz w:val="22"/>
+          <w:szCs w:val="22"/>
+        </w:rPr>
+        <w:t xml:space="preserve">On </w:t>
+      </w:r>
+      <w:r>
+        <w:rPr>
+          <w:b/>
+          <w:bCs/>
+          <w:color w:val="auto"/>
+          <w:sz w:val="22"/>
+          <w:szCs w:val="22"/>
+        </w:rPr>
+        <w:t>the client side</w:t>
+      </w:r>
+      <w:r>
+        <w:rPr>
+          <w:color w:val="auto"/>
+          <w:sz w:val="22"/>
+          <w:szCs w:val="22"/>
+        </w:rPr>
+        <w:t xml:space="preserve">, the application is structured as a </w:t>
+      </w:r>
+      <w:r>
+        <w:rPr>
+          <w:b/>
+          <w:bCs/>
+          <w:color w:val="auto"/>
+          <w:sz w:val="22"/>
+          <w:szCs w:val="22"/>
+        </w:rPr>
+        <w:t>Single Page Application (SPA)</w:t>
+      </w:r>
+      <w:r>
+        <w:rPr>
+          <w:color w:val="auto"/>
+          <w:sz w:val="22"/>
+          <w:szCs w:val="22"/>
+        </w:rPr>
+        <w:t xml:space="preserve"> developed with </w:t>
+      </w:r>
+      <w:r>
+        <w:rPr>
+          <w:b/>
+          <w:bCs/>
+          <w:color w:val="auto"/>
+          <w:sz w:val="22"/>
+          <w:szCs w:val="22"/>
+        </w:rPr>
+        <w:t>Blazor WebAssembly</w:t>
+      </w:r>
+      <w:r>
+        <w:rPr>
+          <w:color w:val="auto"/>
+          <w:sz w:val="22"/>
+          <w:szCs w:val="22"/>
+        </w:rPr>
+        <w:t xml:space="preserve">. It adopts a </w:t>
+      </w:r>
+      <w:r>
+        <w:rPr>
+          <w:b/>
+          <w:bCs/>
+          <w:color w:val="auto"/>
+          <w:sz w:val="22"/>
+          <w:szCs w:val="22"/>
+        </w:rPr>
+        <w:t>Component-Based Architecture</w:t>
+      </w:r>
+      <w:r>
+        <w:rPr>
+          <w:color w:val="auto"/>
+          <w:sz w:val="22"/>
+          <w:szCs w:val="22"/>
+        </w:rPr>
+        <w:t>, dividing the interface into reusable visual components. User interface updates are driven by component state and data-binding mechanisms, allowing efficient synchronization between the displayed content and the underlying application data. This structure enables the client to manage rendering and navigation locally, without requesting new HTML pages from the server, thereby reducing the latency perceived by the user.</w:t>
       </w:r>
     </w:p>
     <w:p>
@@ -2186,17 +2268,15 @@
           <w:sz w:val="22"/>
           <w:szCs w:val="22"/>
         </w:rPr>
-        <w:t xml:space="preserve">On </w:t>
-      </w:r>
-      <w:r>
-        <w:rPr>
-          <w:b/>
-          <w:bCs/>
+        <w:t xml:space="preserve">Communication between the client and </w:t>
+      </w:r>
+      <w:r>
+        <w:rPr>
           <w:color w:val="auto"/>
           <w:sz w:val="22"/>
           <w:szCs w:val="22"/>
         </w:rPr>
-        <w:t>the client side</w:t>
+        <w:t xml:space="preserve">the </w:t>
       </w:r>
       <w:r>
         <w:rPr>
@@ -2204,7 +2284,7 @@
           <w:sz w:val="22"/>
           <w:szCs w:val="22"/>
         </w:rPr>
-        <w:t xml:space="preserve">, the application is structured as a </w:t>
+        <w:t xml:space="preserve">server is conducted exclusively through a </w:t>
       </w:r>
       <w:r>
         <w:rPr>
@@ -2214,7 +2294,7 @@
           <w:sz w:val="22"/>
           <w:szCs w:val="22"/>
         </w:rPr>
-        <w:t>Single Page Application (SPA)</w:t>
+        <w:t>REST API</w:t>
       </w:r>
       <w:r>
         <w:rPr>
@@ -2222,7 +2302,7 @@
           <w:sz w:val="22"/>
           <w:szCs w:val="22"/>
         </w:rPr>
-        <w:t xml:space="preserve"> developed with </w:t>
+        <w:t xml:space="preserve">, using </w:t>
       </w:r>
       <w:r>
         <w:rPr>
@@ -2232,7 +2312,7 @@
           <w:sz w:val="22"/>
           <w:szCs w:val="22"/>
         </w:rPr>
-        <w:t>Blazor WebAssembly</w:t>
+        <w:t>JSON</w:t>
       </w:r>
       <w:r>
         <w:rPr>
@@ -2240,107 +2320,17 @@
           <w:sz w:val="22"/>
           <w:szCs w:val="22"/>
         </w:rPr>
-        <w:t xml:space="preserve">. It adopts a </w:t>
-      </w:r>
-      <w:r>
-        <w:rPr>
-          <w:b/>
-          <w:bCs/>
+        <w:t xml:space="preserve"> as the standard format for data exchange. By isolating external calls into a dedicated service layer on the client, the UI components remain agnostic of how data is retrieved or persisted. This conceptual design was chosen to maximize performance, allowing the server to focus strictly on the rapid execution of bot commands and data integrity, while the client provides a fluid and reactive user experience.</w:t>
+      </w:r>
+    </w:p>
+    <w:p>
+      <w:pPr>
+        <w:pStyle w:val="Heading3"/>
+        <w:rPr>
           <w:color w:val="auto"/>
           <w:sz w:val="22"/>
           <w:szCs w:val="22"/>
         </w:rPr>
-        <w:t>Component-Based Architecture</w:t>
-      </w:r>
-      <w:r>
-        <w:rPr>
-          <w:color w:val="auto"/>
-          <w:sz w:val="22"/>
-          <w:szCs w:val="22"/>
-        </w:rPr>
-        <w:t>, dividing the interface into reusable visual components. User interface updates are driven by component state and data-binding mechanisms, allowing efficient synchronization between the displayed content and the underlying application data. This structure enables the client to manage rendering and navigation locally, without requesting new HTML pages from the server, thereby reducing the latency perceived by the user.</w:t>
-      </w:r>
-    </w:p>
-    <w:p>
-      <w:pPr>
-        <w:pStyle w:val="Heading3"/>
-        <w:ind w:firstLine="720"/>
-        <w:jc w:val="both"/>
-        <w:rPr>
-          <w:color w:val="auto"/>
-          <w:sz w:val="22"/>
-          <w:szCs w:val="22"/>
-        </w:rPr>
-      </w:pPr>
-      <w:r>
-        <w:rPr>
-          <w:color w:val="auto"/>
-          <w:sz w:val="22"/>
-          <w:szCs w:val="22"/>
-        </w:rPr>
-        <w:t xml:space="preserve">Communication between the client and </w:t>
-      </w:r>
-      <w:r>
-        <w:rPr>
-          <w:color w:val="auto"/>
-          <w:sz w:val="22"/>
-          <w:szCs w:val="22"/>
-        </w:rPr>
-        <w:t xml:space="preserve">the </w:t>
-      </w:r>
-      <w:r>
-        <w:rPr>
-          <w:color w:val="auto"/>
-          <w:sz w:val="22"/>
-          <w:szCs w:val="22"/>
-        </w:rPr>
-        <w:t xml:space="preserve">server is conducted exclusively through a </w:t>
-      </w:r>
-      <w:r>
-        <w:rPr>
-          <w:b/>
-          <w:bCs/>
-          <w:color w:val="auto"/>
-          <w:sz w:val="22"/>
-          <w:szCs w:val="22"/>
-        </w:rPr>
-        <w:t>REST API</w:t>
-      </w:r>
-      <w:r>
-        <w:rPr>
-          <w:color w:val="auto"/>
-          <w:sz w:val="22"/>
-          <w:szCs w:val="22"/>
-        </w:rPr>
-        <w:t xml:space="preserve">, using </w:t>
-      </w:r>
-      <w:r>
-        <w:rPr>
-          <w:b/>
-          <w:bCs/>
-          <w:color w:val="auto"/>
-          <w:sz w:val="22"/>
-          <w:szCs w:val="22"/>
-        </w:rPr>
-        <w:t>JSON</w:t>
-      </w:r>
-      <w:r>
-        <w:rPr>
-          <w:color w:val="auto"/>
-          <w:sz w:val="22"/>
-          <w:szCs w:val="22"/>
-        </w:rPr>
-        <w:t xml:space="preserve"> as the standard format for data exchange. By isolating external calls into a dedicated service layer on the client, the UI components remain agnostic of how data is retrieved or persisted. This conceptual design was chosen to maximize performance, allowing the server to focus strictly on the rapid execution of bot commands and data integrity, while the client provides a fluid and reactive user experience.</w:t>
-      </w:r>
-    </w:p>
-    <w:p>
-      <w:pPr>
-        <w:pStyle w:val="Heading3"/>
-        <w:rPr>
-          <w:color w:val="auto"/>
-          <w:sz w:val="22"/>
-          <w:szCs w:val="22"/>
-        </w:rPr>
       </w:pPr>
     </w:p>
     <w:p/>
@@ -2372,10 +2362,11 @@
       <w:bookmarkEnd w:id="4"/>
       <w:r>
         <w:rPr>
+          <w:noProof/>
           <w:lang w:val="en-US"/>
         </w:rPr>
         <w:drawing>
-          <wp:inline distT="0" distB="0" distL="0" distR="0" wp14:anchorId="7E25C378" wp14:editId="49FFE4A1">
+          <wp:inline distT="0" distB="0" distL="0" distR="0" wp14:anchorId="7E25C378" wp14:editId="2E9F7F08">
             <wp:extent cx="6350444" cy="5372100"/>
             <wp:effectExtent l="0" t="0" r="0" b="0"/>
             <wp:docPr id="101518191" name="Picture 4"/>
@@ -2447,6 +2438,7 @@
       </w:pPr>
       <w:r>
         <w:rPr>
+          <w:noProof/>
           <w:lang w:val="en-US"/>
         </w:rPr>
         <w:drawing>
@@ -2574,11 +2566,6 @@
       </w:r>
     </w:p>
     <w:p>
-      <w:r>
-        <w:t>[Functional Baseline]</w:t>
-      </w:r>
-    </w:p>
-    <w:p>
       <w:pPr>
         <w:pStyle w:val="Heading2"/>
       </w:pPr>
@@ -2601,9 +2588,132 @@
     <w:p>
       <w:pPr>
         <w:spacing w:before="240" w:after="240"/>
-      </w:pPr>
-      <w:r>
-        <w:t>[Create interaction diagrams that illustrate how the system behaves at runtime. Include at least a sequence diagram to show the time‑ordered exchange of messages between objects or components, and a communication diagram to highlight the relationships and message flow among collaborating elements.]</w:t>
+        <w:rPr>
+          <w:lang w:val="en-US"/>
+        </w:rPr>
+      </w:pPr>
+      <w:r>
+        <w:rPr>
+          <w:lang w:val="en-US"/>
+        </w:rPr>
+        <w:drawing>
+          <wp:inline distT="0" distB="0" distL="0" distR="0" wp14:anchorId="25E843A9" wp14:editId="53979E7E">
+            <wp:extent cx="6415088" cy="2918016"/>
+            <wp:effectExtent l="0" t="0" r="5080" b="0"/>
+            <wp:docPr id="1577716837" name="Picture 1"/>
+            <wp:cNvGraphicFramePr>
+              <a:graphicFrameLocks xmlns:a="http://schemas.openxmlformats.org/drawingml/2006/main" noChangeAspect="1"/>
+            </wp:cNvGraphicFramePr>
+            <a:graphic xmlns:a="http://schemas.openxmlformats.org/drawingml/2006/main">
+              <a:graphicData uri="http://schemas.openxmlformats.org/drawingml/2006/picture">
+                <pic:pic xmlns:pic="http://schemas.openxmlformats.org/drawingml/2006/picture">
+                  <pic:nvPicPr>
+                    <pic:cNvPr id="0" name="Picture 1"/>
+                    <pic:cNvPicPr>
+                      <a:picLocks noChangeAspect="1" noChangeArrowheads="1"/>
+                    </pic:cNvPicPr>
+                  </pic:nvPicPr>
+                  <pic:blipFill>
+                    <a:blip r:embed="rId11" cstate="print">
+                      <a:extLst>
+                        <a:ext uri="{28A0092B-C50C-407E-A947-70E740481C1C}">
+                          <a14:useLocalDpi xmlns:a14="http://schemas.microsoft.com/office/drawing/2010/main" val="0"/>
+                        </a:ext>
+                      </a:extLst>
+                    </a:blip>
+                    <a:srcRect/>
+                    <a:stretch>
+                      <a:fillRect/>
+                    </a:stretch>
+                  </pic:blipFill>
+                  <pic:spPr bwMode="auto">
+                    <a:xfrm>
+                      <a:off x="0" y="0"/>
+                      <a:ext cx="6455309" cy="2936311"/>
+                    </a:xfrm>
+                    <a:prstGeom prst="rect">
+                      <a:avLst/>
+                    </a:prstGeom>
+                    <a:noFill/>
+                    <a:ln>
+                      <a:noFill/>
+                    </a:ln>
+                  </pic:spPr>
+                </pic:pic>
+              </a:graphicData>
+            </a:graphic>
+          </wp:inline>
+        </w:drawing>
+      </w:r>
+    </w:p>
+    <w:p>
+      <w:pPr>
+        <w:spacing w:before="240" w:after="240"/>
+        <w:rPr>
+          <w:lang w:val="en-US"/>
+        </w:rPr>
+      </w:pPr>
+    </w:p>
+    <w:p>
+      <w:pPr>
+        <w:spacing w:before="240" w:after="240"/>
+        <w:jc w:val="center"/>
+        <w:rPr>
+          <w:lang w:val="en-US"/>
+        </w:rPr>
+      </w:pPr>
+      <w:r>
+        <w:rPr>
+          <w:noProof/>
+        </w:rPr>
+        <w:drawing>
+          <wp:inline distT="0" distB="0" distL="0" distR="0" wp14:anchorId="47B7E6A2" wp14:editId="233EF7D2">
+            <wp:extent cx="4807870" cy="2033587"/>
+            <wp:effectExtent l="0" t="0" r="0" b="5080"/>
+            <wp:docPr id="1339698086" name="Picture 2"/>
+            <wp:cNvGraphicFramePr>
+              <a:graphicFrameLocks xmlns:a="http://schemas.openxmlformats.org/drawingml/2006/main" noChangeAspect="1"/>
+            </wp:cNvGraphicFramePr>
+            <a:graphic xmlns:a="http://schemas.openxmlformats.org/drawingml/2006/main">
+              <a:graphicData uri="http://schemas.openxmlformats.org/drawingml/2006/picture">
+                <pic:pic xmlns:pic="http://schemas.openxmlformats.org/drawingml/2006/picture">
+                  <pic:nvPicPr>
+                    <pic:cNvPr id="0" name="Picture 3"/>
+                    <pic:cNvPicPr>
+                      <a:picLocks noChangeAspect="1" noChangeArrowheads="1"/>
+                    </pic:cNvPicPr>
+                  </pic:nvPicPr>
+                  <pic:blipFill>
+                    <a:blip r:embed="rId12" cstate="print">
+                      <a:extLst>
+                        <a:ext uri="{28A0092B-C50C-407E-A947-70E740481C1C}">
+                          <a14:useLocalDpi xmlns:a14="http://schemas.microsoft.com/office/drawing/2010/main" val="0"/>
+                        </a:ext>
+                      </a:extLst>
+                    </a:blip>
+                    <a:srcRect/>
+                    <a:stretch>
+                      <a:fillRect/>
+                    </a:stretch>
+                  </pic:blipFill>
+                  <pic:spPr bwMode="auto">
+                    <a:xfrm>
+                      <a:off x="0" y="0"/>
+                      <a:ext cx="4899101" cy="2072175"/>
+                    </a:xfrm>
+                    <a:prstGeom prst="rect">
+                      <a:avLst/>
+                    </a:prstGeom>
+                    <a:noFill/>
+                    <a:ln>
+                      <a:noFill/>
+                    </a:ln>
+                  </pic:spPr>
+                </pic:pic>
+              </a:graphicData>
+            </a:graphic>
+          </wp:inline>
+        </w:drawing>
       </w:r>
     </w:p>
     <w:p>
@@ -2613,16 +2723,155 @@
       <w:bookmarkStart w:id="8" w:name="_ei93dmv4zmqg" w:colFirst="0" w:colLast="0"/>
       <w:bookmarkEnd w:id="8"/>
       <w:r>
+        <w:lastRenderedPageBreak/>
         <w:t>3.1.2 Class Design</w:t>
       </w:r>
     </w:p>
     <w:p>
       <w:pPr>
         <w:spacing w:before="240" w:after="240"/>
-      </w:pPr>
-      <w:r>
-        <w:t>[Create the UML class diagram for the system. Include classes, attributes, methods, and relationships. Apply appropriate object‑oriented design patterns where they improve structure or flexibility, and explain the motivation behind the pattern used.]</w:t>
-      </w:r>
+        <w:jc w:val="center"/>
+        <w:rPr>
+          <w:lang w:val="en-US"/>
+        </w:rPr>
+      </w:pPr>
+      <w:r>
+        <w:rPr>
+          <w:lang w:val="en-US"/>
+        </w:rPr>
+        <w:drawing>
+          <wp:inline distT="0" distB="0" distL="0" distR="0" wp14:anchorId="783DACF0" wp14:editId="4FA53DE1">
+            <wp:extent cx="6279776" cy="6066254"/>
+            <wp:effectExtent l="0" t="0" r="6985" b="0"/>
+            <wp:docPr id="62641352" name="Picture 3"/>
+            <wp:cNvGraphicFramePr>
+              <a:graphicFrameLocks xmlns:a="http://schemas.openxmlformats.org/drawingml/2006/main" noChangeAspect="1"/>
+            </wp:cNvGraphicFramePr>
+            <a:graphic xmlns:a="http://schemas.openxmlformats.org/drawingml/2006/main">
+              <a:graphicData uri="http://schemas.openxmlformats.org/drawingml/2006/picture">
+                <pic:pic xmlns:pic="http://schemas.openxmlformats.org/drawingml/2006/picture">
+                  <pic:nvPicPr>
+                    <pic:cNvPr id="0" name="Picture 5"/>
+                    <pic:cNvPicPr>
+                      <a:picLocks noChangeAspect="1" noChangeArrowheads="1"/>
+                    </pic:cNvPicPr>
+                  </pic:nvPicPr>
+                  <pic:blipFill>
+                    <a:blip r:embed="rId13" cstate="print">
+                      <a:extLst>
+                        <a:ext uri="{28A0092B-C50C-407E-A947-70E740481C1C}">
+                          <a14:useLocalDpi xmlns:a14="http://schemas.microsoft.com/office/drawing/2010/main" val="0"/>
+                        </a:ext>
+                      </a:extLst>
+                    </a:blip>
+                    <a:srcRect/>
+                    <a:stretch>
+                      <a:fillRect/>
+                    </a:stretch>
+                  </pic:blipFill>
+                  <pic:spPr bwMode="auto">
+                    <a:xfrm>
+                      <a:off x="0" y="0"/>
+                      <a:ext cx="6294403" cy="6080383"/>
+                    </a:xfrm>
+                    <a:prstGeom prst="rect">
+                      <a:avLst/>
+                    </a:prstGeom>
+                    <a:noFill/>
+                    <a:ln>
+                      <a:noFill/>
+                    </a:ln>
+                  </pic:spPr>
+                </pic:pic>
+              </a:graphicData>
+            </a:graphic>
+          </wp:inline>
+        </w:drawing>
+      </w:r>
+    </w:p>
+    <w:p>
+      <w:pPr>
+        <w:spacing w:before="240" w:after="240"/>
+        <w:jc w:val="both"/>
+        <w:rPr>
+          <w:lang w:val="en-US"/>
+        </w:rPr>
+      </w:pPr>
+      <w:r>
+        <w:rPr>
+          <w:lang w:val="en-US"/>
+        </w:rPr>
+        <w:tab/>
+      </w:r>
+      <w:r>
+        <w:rPr>
+          <w:lang w:val="en-US"/>
+        </w:rPr>
+        <w:t xml:space="preserve">The application's architecture leverages specific object-oriented design patterns to enhance structural flexibility and maintainability. The </w:t>
+      </w:r>
+      <w:r>
+        <w:rPr>
+          <w:b/>
+          <w:bCs/>
+          <w:lang w:val="en-US"/>
+        </w:rPr>
+        <w:t>Pipeline Pattern</w:t>
+      </w:r>
+      <w:r>
+        <w:rPr>
+          <w:lang w:val="en-US"/>
+        </w:rPr>
+        <w:t xml:space="preserve"> is implemented within the core logic to manage the sequential flow of message processing through modular, independent steps. To handle specific bot logic, the </w:t>
+      </w:r>
+      <w:r>
+        <w:rPr>
+          <w:b/>
+          <w:bCs/>
+          <w:lang w:val="en-US"/>
+        </w:rPr>
+        <w:t>Command Pattern</w:t>
+      </w:r>
+      <w:r>
+        <w:rPr>
+          <w:lang w:val="en-US"/>
+        </w:rPr>
+        <w:t xml:space="preserve"> encapsulates individual bot commands into standalone classes, enabling the effortless addition of new features without modifying the core engine. Finally, the </w:t>
+      </w:r>
+      <w:r>
+        <w:rPr>
+          <w:b/>
+          <w:bCs/>
+          <w:lang w:val="en-US"/>
+        </w:rPr>
+        <w:t>Repository Pattern</w:t>
+      </w:r>
+      <w:r>
+        <w:rPr>
+          <w:lang w:val="en-US"/>
+        </w:rPr>
+        <w:t xml:space="preserve"> is </w:t>
+      </w:r>
+      <w:r>
+        <w:rPr>
+          <w:lang w:val="en-US"/>
+        </w:rPr>
+        <w:t>used</w:t>
+      </w:r>
+      <w:r>
+        <w:rPr>
+          <w:lang w:val="en-US"/>
+        </w:rPr>
+        <w:t xml:space="preserve"> to isolate business logic from database details, ensuring the system remains maintainable and agnostic of the underlying data storage layer.</w:t>
+      </w:r>
+    </w:p>
+    <w:p>
+      <w:pPr>
+        <w:spacing w:before="240" w:after="240"/>
+        <w:jc w:val="both"/>
+        <w:rPr>
+          <w:lang w:val="en-US"/>
+        </w:rPr>
+      </w:pPr>
     </w:p>
     <w:p>
       <w:pPr>
@@ -2631,6 +2880,7 @@
       <w:bookmarkStart w:id="9" w:name="_o23k9mn3sog7" w:colFirst="0" w:colLast="0"/>
       <w:bookmarkEnd w:id="9"/>
       <w:r>
+        <w:lastRenderedPageBreak/>
         <w:t>3.2 Data Model</w:t>
       </w:r>
     </w:p>
@@ -2641,6 +2891,132 @@
       <w:r>
         <w:t>[Develop the system’s data model, including the ER diagram or relational schema, and explain how this structure supports the system’s functional and data requirements.]</w:t>
       </w:r>
+    </w:p>
+    <w:p>
+      <w:pPr>
+        <w:spacing w:before="240" w:after="240"/>
+        <w:jc w:val="center"/>
+        <w:rPr>
+          <w:lang w:val="en-US"/>
+        </w:rPr>
+      </w:pPr>
+      <w:r>
+        <w:rPr>
+          <w:lang w:val="en-US"/>
+        </w:rPr>
+        <w:drawing>
+          <wp:inline distT="0" distB="0" distL="0" distR="0" wp14:anchorId="6ED492B6" wp14:editId="3C6BFC5C">
+            <wp:extent cx="5073015" cy="3625669"/>
+            <wp:effectExtent l="0" t="0" r="0" b="0"/>
+            <wp:docPr id="787116942" name="Picture 5"/>
+            <wp:cNvGraphicFramePr>
+              <a:graphicFrameLocks xmlns:a="http://schemas.openxmlformats.org/drawingml/2006/main" noChangeAspect="1"/>
+            </wp:cNvGraphicFramePr>
+            <a:graphic xmlns:a="http://schemas.openxmlformats.org/drawingml/2006/main">
+              <a:graphicData uri="http://schemas.openxmlformats.org/drawingml/2006/picture">
+                <pic:pic xmlns:pic="http://schemas.openxmlformats.org/drawingml/2006/picture">
+                  <pic:nvPicPr>
+                    <pic:cNvPr id="0" name="Picture 12"/>
+                    <pic:cNvPicPr>
+                      <a:picLocks noChangeAspect="1" noChangeArrowheads="1"/>
+                    </pic:cNvPicPr>
+                  </pic:nvPicPr>
+                  <pic:blipFill>
+                    <a:blip r:embed="rId14" cstate="print">
+                      <a:extLst>
+                        <a:ext uri="{28A0092B-C50C-407E-A947-70E740481C1C}">
+                          <a14:useLocalDpi xmlns:a14="http://schemas.microsoft.com/office/drawing/2010/main" val="0"/>
+                        </a:ext>
+                      </a:extLst>
+                    </a:blip>
+                    <a:srcRect/>
+                    <a:stretch>
+                      <a:fillRect/>
+                    </a:stretch>
+                  </pic:blipFill>
+                  <pic:spPr bwMode="auto">
+                    <a:xfrm>
+                      <a:off x="0" y="0"/>
+                      <a:ext cx="5077615" cy="3628956"/>
+                    </a:xfrm>
+                    <a:prstGeom prst="rect">
+                      <a:avLst/>
+                    </a:prstGeom>
+                    <a:noFill/>
+                    <a:ln>
+                      <a:noFill/>
+                    </a:ln>
+                  </pic:spPr>
+                </pic:pic>
+              </a:graphicData>
+            </a:graphic>
+          </wp:inline>
+        </w:drawing>
+      </w:r>
+    </w:p>
+    <w:p>
+      <w:pPr>
+        <w:spacing w:before="240" w:after="240"/>
+        <w:ind w:firstLine="720"/>
+        <w:jc w:val="both"/>
+        <w:rPr>
+          <w:lang w:val="en-US"/>
+        </w:rPr>
+      </w:pPr>
+      <w:r>
+        <w:t xml:space="preserve">The relational data model for </w:t>
+      </w:r>
+      <w:r>
+        <w:rPr>
+          <w:b/>
+          <w:bCs/>
+        </w:rPr>
+        <w:t>ChattyBot</w:t>
+      </w:r>
+      <w:r>
+        <w:t xml:space="preserve"> is strategically designed to fulfill the system's core functional and data requirements. By establishing a hierarchical structure where </w:t>
+      </w:r>
+      <w:r>
+        <w:rPr>
+          <w:b/>
+          <w:bCs/>
+        </w:rPr>
+        <w:t>users</w:t>
+      </w:r>
+      <w:r>
+        <w:t xml:space="preserve"> own multiple </w:t>
+      </w:r>
+      <w:r>
+        <w:rPr>
+          <w:b/>
+          <w:bCs/>
+        </w:rPr>
+        <w:t>chatconversations</w:t>
+      </w:r>
+      <w:r>
+        <w:t xml:space="preserve">, the schema ensures secure data isolation and private session management. The dedicated tables for entertainment content, such as jokes and triviaquestions, provide the rule-based engine with instant access to structured data, facilitating the requirement for near-instant bot responses. Furthermore, the organized storage of timestamped logs within the </w:t>
+      </w:r>
+      <w:r>
+        <w:rPr>
+          <w:b/>
+          <w:bCs/>
+        </w:rPr>
+        <w:t>chatmessages</w:t>
+      </w:r>
+      <w:r>
+        <w:t xml:space="preserve"> table allows for efficient data retrieval, directly supporting the "Data Portability" objective by making it simple to transform relational records into standardized JSON or XML export formats. This structure guarantees both high-speed interactive utility and the long-term data integrity necessary for a reliable </w:t>
+      </w:r>
+      <w:r>
+        <w:t>chatbot</w:t>
+      </w:r>
+      <w:r>
+        <w:t>.</w:t>
+      </w:r>
+    </w:p>
+    <w:p>
+      <w:pPr>
+        <w:spacing w:before="240" w:after="240"/>
+      </w:pPr>
     </w:p>
     <w:p>
       <w:pPr>
@@ -2662,62 +3038,200 @@
     </w:p>
     <w:p>
       <w:pPr>
+        <w:spacing w:before="240" w:after="240"/>
+        <w:ind w:firstLine="720"/>
+        <w:jc w:val="both"/>
+      </w:pPr>
+      <w:r>
+        <w:t xml:space="preserve">The unit testing strategy for ChattyBot adopts a "Layer-Isolation" approach, focusing primarily on the Application Layer where the core business logic resides. By </w:t>
+      </w:r>
+      <w:r>
+        <w:t>using</w:t>
+      </w:r>
+      <w:r>
+        <w:t xml:space="preserve"> xUnit and mocking dependencies like the IChatRepository with Moq, the strategy aims to verify that each step of the processing pipeline and every bot command functions correctly in isolation. This </w:t>
+      </w:r>
+      <w:r>
+        <w:lastRenderedPageBreak/>
+        <w:t>automated approach ensures that the system remains stable and that bot responses are predictable</w:t>
+      </w:r>
+      <w:r>
+        <w:t xml:space="preserve"> </w:t>
+      </w:r>
+      <w:r>
+        <w:t>and accurate before moving toward full system integration.</w:t>
+      </w:r>
+    </w:p>
+    <w:p>
+      <w:pPr>
+        <w:spacing w:before="240" w:after="240"/>
+        <w:jc w:val="both"/>
+        <w:rPr>
+          <w:b/>
+          <w:bCs/>
+        </w:rPr>
+      </w:pPr>
+      <w:r>
+        <w:rPr>
+          <w:b/>
+          <w:bCs/>
+        </w:rPr>
+        <w:t>Proposed Test Case Scenarios</w:t>
+      </w:r>
+      <w:r>
+        <w:rPr>
+          <w:b/>
+          <w:bCs/>
+        </w:rPr>
+        <w:t>:</w:t>
+      </w:r>
+    </w:p>
+    <w:p>
+      <w:pPr>
+        <w:pStyle w:val="ListParagraph"/>
+        <w:numPr>
+          <w:ilvl w:val="0"/>
+          <w:numId w:val="2"/>
+        </w:numPr>
+        <w:spacing w:before="240" w:after="240"/>
+        <w:jc w:val="both"/>
+      </w:pPr>
+      <w:r>
+        <w:rPr>
+          <w:b/>
+          <w:bCs/>
+        </w:rPr>
+        <w:t>BotEngine Command Resolution</w:t>
+      </w:r>
+      <w:r>
+        <w:t>: Inputting a valid command, such as "/joke", successfully triggers the execution of the corresponding JokeCommand logic.</w:t>
+      </w:r>
+    </w:p>
+    <w:p>
+      <w:pPr>
+        <w:pStyle w:val="ListParagraph"/>
+        <w:numPr>
+          <w:ilvl w:val="0"/>
+          <w:numId w:val="2"/>
+        </w:numPr>
+        <w:spacing w:before="240" w:after="240"/>
+        <w:jc w:val="both"/>
+      </w:pPr>
+      <w:r>
+        <w:rPr>
+          <w:b/>
+          <w:bCs/>
+        </w:rPr>
+        <w:t>Message Context Identification</w:t>
+      </w:r>
+      <w:r>
+        <w:t>: The CommandDetectionStep correctly distinguishes between specialized bot commands based on the "/" prefix.</w:t>
+      </w:r>
+    </w:p>
+    <w:p>
+      <w:pPr>
+        <w:pStyle w:val="ListParagraph"/>
+        <w:numPr>
+          <w:ilvl w:val="0"/>
+          <w:numId w:val="2"/>
+        </w:numPr>
+        <w:spacing w:before="240" w:after="240"/>
+        <w:jc w:val="both"/>
+      </w:pPr>
+      <w:r>
+        <w:rPr>
+          <w:b/>
+          <w:bCs/>
+        </w:rPr>
+        <w:t>Persistence Interaction</w:t>
+      </w:r>
+      <w:r>
+        <w:t>: The PersistenceStep correctly invokes the repository's saving methods to ensure that both user inputs and bot responses are stored in the database.</w:t>
+      </w:r>
+    </w:p>
+    <w:p>
+      <w:pPr>
+        <w:pStyle w:val="ListParagraph"/>
+        <w:numPr>
+          <w:ilvl w:val="0"/>
+          <w:numId w:val="2"/>
+        </w:numPr>
+        <w:spacing w:before="240" w:after="240"/>
+        <w:jc w:val="both"/>
+      </w:pPr>
+      <w:r>
+        <w:rPr>
+          <w:b/>
+          <w:bCs/>
+        </w:rPr>
+        <w:t>Input Validation &amp; Error Handling</w:t>
+      </w:r>
+      <w:r>
+        <w:t>: The system gracefully handles unrecognized commands or empty inputs by returning a predefined "unrecognized command" message or a list of valid options.</w:t>
+      </w:r>
+    </w:p>
+    <w:p>
+      <w:pPr>
+        <w:pStyle w:val="ListParagraph"/>
+        <w:spacing w:before="240" w:after="240"/>
+        <w:jc w:val="both"/>
+      </w:pPr>
+    </w:p>
+    <w:p>
+      <w:pPr>
         <w:pStyle w:val="Heading1"/>
       </w:pPr>
-      <w:bookmarkStart w:id="11" w:name="_z0opy1955bhg" w:colFirst="0" w:colLast="0"/>
+      <w:r>
+        <w:t>4. Elaboration – Iteration 2</w:t>
+      </w:r>
+    </w:p>
+    <w:p>
+      <w:r>
+        <w:t>[Final Architecture Baseline]</w:t>
+      </w:r>
+    </w:p>
+    <w:p>
+      <w:pPr>
+        <w:pStyle w:val="Heading2"/>
+      </w:pPr>
+      <w:bookmarkStart w:id="11" w:name="_gkphul3nort0" w:colFirst="0" w:colLast="0"/>
       <w:bookmarkEnd w:id="11"/>
       <w:r>
-        <w:t>4. Elaboration – Iteration 2</w:t>
-      </w:r>
-    </w:p>
-    <w:p>
-      <w:r>
-        <w:t>[Final Architecture Baseline]</w:t>
+        <w:t>4.1 Architectural Design Refinement</w:t>
+      </w:r>
+    </w:p>
+    <w:p>
+      <w:pPr>
+        <w:spacing w:before="240" w:after="240"/>
+      </w:pPr>
+      <w:r>
+        <w:t>[Refine the architectural design using the insights gained from previous iterations. Update (add here, do not change the previous iterations) the conceptual architecture, package structure, component &amp; deployment diagrams, applying relevant design principles. Clearly explain the reasons behind each change.]</w:t>
       </w:r>
     </w:p>
     <w:p>
       <w:pPr>
         <w:pStyle w:val="Heading2"/>
       </w:pPr>
-      <w:bookmarkStart w:id="12" w:name="_gkphul3nort0" w:colFirst="0" w:colLast="0"/>
+      <w:bookmarkStart w:id="12" w:name="_oviey2izzw8c" w:colFirst="0" w:colLast="0"/>
       <w:bookmarkEnd w:id="12"/>
       <w:r>
-        <w:lastRenderedPageBreak/>
-        <w:t>4.1 Architectural Design Refinement</w:t>
-      </w:r>
-    </w:p>
-    <w:p>
-      <w:pPr>
-        <w:spacing w:before="240" w:after="240"/>
-      </w:pPr>
-      <w:r>
-        <w:t>[Refine the architectural design using the insights gained from previous iterations. Update (add here, do not change the previous iterations) the conceptual architecture, package structure, component &amp; deployment diagrams, applying relevant design principles. Clearly explain the reasons behind each change.]</w:t>
-      </w:r>
-    </w:p>
-    <w:p>
-      <w:pPr>
-        <w:pStyle w:val="Heading2"/>
-      </w:pPr>
-      <w:bookmarkStart w:id="13" w:name="_oviey2izzw8c" w:colFirst="0" w:colLast="0"/>
+        <w:t>4.2 Design Model Refinement</w:t>
+      </w:r>
+    </w:p>
+    <w:p>
+      <w:pPr>
+        <w:spacing w:before="240" w:after="240"/>
+      </w:pPr>
+      <w:r>
+        <w:t>[Add the (new) updated UML class diagram by applying appropriate object‑oriented design patterns, Architectural or structural guidelines, GRASP patterns. Explain the reasoning behind your design decisions and include the revised diagrams.]</w:t>
+      </w:r>
+    </w:p>
+    <w:p>
+      <w:pPr>
+        <w:pStyle w:val="Heading1"/>
+      </w:pPr>
+      <w:bookmarkStart w:id="13" w:name="_1we2sw3db6i1" w:colFirst="0" w:colLast="0"/>
       <w:bookmarkEnd w:id="13"/>
-      <w:r>
-        <w:t>4.2 Design Model Refinement</w:t>
-      </w:r>
-    </w:p>
-    <w:p>
-      <w:pPr>
-        <w:spacing w:before="240" w:after="240"/>
-      </w:pPr>
-      <w:r>
-        <w:t>[Add the (new) updated UML class diagram by applying appropriate object‑oriented design patterns, Architectural or structural guidelines, GRASP patterns. Explain the reasoning behind your design decisions and include the revised diagrams.]</w:t>
-      </w:r>
-    </w:p>
-    <w:p>
-      <w:pPr>
-        <w:pStyle w:val="Heading1"/>
-      </w:pPr>
-      <w:bookmarkStart w:id="14" w:name="_1we2sw3db6i1" w:colFirst="0" w:colLast="0"/>
-      <w:bookmarkEnd w:id="14"/>
       <w:r>
         <w:t>5. Construction and Transition</w:t>
       </w:r>
@@ -2728,44 +3242,45 @@
         <w:keepNext w:val="0"/>
         <w:keepLines w:val="0"/>
       </w:pPr>
-      <w:bookmarkStart w:id="15" w:name="_rzx227jx1o5m" w:colFirst="0" w:colLast="0"/>
+      <w:bookmarkStart w:id="14" w:name="_rzx227jx1o5m" w:colFirst="0" w:colLast="0"/>
+      <w:bookmarkEnd w:id="14"/>
+      <w:r>
+        <w:t>5.1 System Testing</w:t>
+      </w:r>
+    </w:p>
+    <w:p>
+      <w:pPr>
+        <w:spacing w:before="240" w:after="240"/>
+      </w:pPr>
+      <w:r>
+        <w:t>[Explain how integration testing was carried out, outlining the methods used and presenting the relevant test case scenarios. Describe how these tests confirm that the system behaves as expected.]</w:t>
+      </w:r>
+    </w:p>
+    <w:p>
+      <w:pPr>
+        <w:pStyle w:val="Heading2"/>
+      </w:pPr>
+      <w:bookmarkStart w:id="15" w:name="_ytzpv1se71cx" w:colFirst="0" w:colLast="0"/>
       <w:bookmarkEnd w:id="15"/>
       <w:r>
-        <w:t>5.1 System Testing</w:t>
-      </w:r>
-    </w:p>
-    <w:p>
-      <w:pPr>
-        <w:spacing w:before="240" w:after="240"/>
-      </w:pPr>
-      <w:r>
-        <w:t>[Explain how integration testing was carried out, outlining the methods used and presenting the relevant test case scenarios. Describe how these tests confirm that the system behaves as expected.]</w:t>
-      </w:r>
-    </w:p>
-    <w:p>
-      <w:pPr>
-        <w:pStyle w:val="Heading2"/>
-      </w:pPr>
-      <w:bookmarkStart w:id="16" w:name="_ytzpv1se71cx" w:colFirst="0" w:colLast="0"/>
+        <w:lastRenderedPageBreak/>
+        <w:t>5.2 Future Improvements</w:t>
+      </w:r>
+    </w:p>
+    <w:p>
+      <w:pPr>
+        <w:spacing w:before="240" w:after="240"/>
+      </w:pPr>
+      <w:r>
+        <w:t>[Outline potential future enhancements for the system, describing improvements that could be introduced in later versions.]</w:t>
+      </w:r>
+    </w:p>
+    <w:p>
+      <w:pPr>
+        <w:pStyle w:val="Heading1"/>
+      </w:pPr>
+      <w:bookmarkStart w:id="16" w:name="_s5av73rt6eq0" w:colFirst="0" w:colLast="0"/>
       <w:bookmarkEnd w:id="16"/>
-      <w:r>
-        <w:t>5.2 Future Improvements</w:t>
-      </w:r>
-    </w:p>
-    <w:p>
-      <w:pPr>
-        <w:spacing w:before="240" w:after="240"/>
-      </w:pPr>
-      <w:r>
-        <w:t>[Outline potential future enhancements for the system, describing improvements that could be introduced in later versions.]</w:t>
-      </w:r>
-    </w:p>
-    <w:p>
-      <w:pPr>
-        <w:pStyle w:val="Heading1"/>
-      </w:pPr>
-      <w:bookmarkStart w:id="17" w:name="_s5av73rt6eq0" w:colFirst="0" w:colLast="0"/>
-      <w:bookmarkEnd w:id="17"/>
       <w:r>
         <w:t>6. Bibliography</w:t>
       </w:r>
@@ -2909,8 +3424,124 @@
       </w:rPr>
     </w:lvl>
   </w:abstractNum>
+  <w:abstractNum w:abstractNumId="1" w15:restartNumberingAfterBreak="0">
+    <w:nsid w:val="4D5875C5"/>
+    <w:multiLevelType w:val="hybridMultilevel"/>
+    <w:tmpl w:val="CB0ABA46"/>
+    <w:lvl w:ilvl="0" w:tplc="04090001">
+      <w:start w:val="1"/>
+      <w:numFmt w:val="bullet"/>
+      <w:lvlText w:val=""/>
+      <w:lvlJc w:val="left"/>
+      <w:pPr>
+        <w:ind w:left="720" w:hanging="360"/>
+      </w:pPr>
+      <w:rPr>
+        <w:rFonts w:ascii="Symbol" w:hAnsi="Symbol" w:hint="default"/>
+      </w:rPr>
+    </w:lvl>
+    <w:lvl w:ilvl="1" w:tplc="04090003" w:tentative="1">
+      <w:start w:val="1"/>
+      <w:numFmt w:val="bullet"/>
+      <w:lvlText w:val="o"/>
+      <w:lvlJc w:val="left"/>
+      <w:pPr>
+        <w:ind w:left="1440" w:hanging="360"/>
+      </w:pPr>
+      <w:rPr>
+        <w:rFonts w:ascii="Courier New" w:hAnsi="Courier New" w:cs="Courier New" w:hint="default"/>
+      </w:rPr>
+    </w:lvl>
+    <w:lvl w:ilvl="2" w:tplc="04090005" w:tentative="1">
+      <w:start w:val="1"/>
+      <w:numFmt w:val="bullet"/>
+      <w:lvlText w:val=""/>
+      <w:lvlJc w:val="left"/>
+      <w:pPr>
+        <w:ind w:left="2160" w:hanging="360"/>
+      </w:pPr>
+      <w:rPr>
+        <w:rFonts w:ascii="Wingdings" w:hAnsi="Wingdings" w:hint="default"/>
+      </w:rPr>
+    </w:lvl>
+    <w:lvl w:ilvl="3" w:tplc="04090001" w:tentative="1">
+      <w:start w:val="1"/>
+      <w:numFmt w:val="bullet"/>
+      <w:lvlText w:val=""/>
+      <w:lvlJc w:val="left"/>
+      <w:pPr>
+        <w:ind w:left="2880" w:hanging="360"/>
+      </w:pPr>
+      <w:rPr>
+        <w:rFonts w:ascii="Symbol" w:hAnsi="Symbol" w:hint="default"/>
+      </w:rPr>
+    </w:lvl>
+    <w:lvl w:ilvl="4" w:tplc="04090003" w:tentative="1">
+      <w:start w:val="1"/>
+      <w:numFmt w:val="bullet"/>
+      <w:lvlText w:val="o"/>
+      <w:lvlJc w:val="left"/>
+      <w:pPr>
+        <w:ind w:left="3600" w:hanging="360"/>
+      </w:pPr>
+      <w:rPr>
+        <w:rFonts w:ascii="Courier New" w:hAnsi="Courier New" w:cs="Courier New" w:hint="default"/>
+      </w:rPr>
+    </w:lvl>
+    <w:lvl w:ilvl="5" w:tplc="04090005" w:tentative="1">
+      <w:start w:val="1"/>
+      <w:numFmt w:val="bullet"/>
+      <w:lvlText w:val=""/>
+      <w:lvlJc w:val="left"/>
+      <w:pPr>
+        <w:ind w:left="4320" w:hanging="360"/>
+      </w:pPr>
+      <w:rPr>
+        <w:rFonts w:ascii="Wingdings" w:hAnsi="Wingdings" w:hint="default"/>
+      </w:rPr>
+    </w:lvl>
+    <w:lvl w:ilvl="6" w:tplc="04090001" w:tentative="1">
+      <w:start w:val="1"/>
+      <w:numFmt w:val="bullet"/>
+      <w:lvlText w:val=""/>
+      <w:lvlJc w:val="left"/>
+      <w:pPr>
+        <w:ind w:left="5040" w:hanging="360"/>
+      </w:pPr>
+      <w:rPr>
+        <w:rFonts w:ascii="Symbol" w:hAnsi="Symbol" w:hint="default"/>
+      </w:rPr>
+    </w:lvl>
+    <w:lvl w:ilvl="7" w:tplc="04090003" w:tentative="1">
+      <w:start w:val="1"/>
+      <w:numFmt w:val="bullet"/>
+      <w:lvlText w:val="o"/>
+      <w:lvlJc w:val="left"/>
+      <w:pPr>
+        <w:ind w:left="5760" w:hanging="360"/>
+      </w:pPr>
+      <w:rPr>
+        <w:rFonts w:ascii="Courier New" w:hAnsi="Courier New" w:cs="Courier New" w:hint="default"/>
+      </w:rPr>
+    </w:lvl>
+    <w:lvl w:ilvl="8" w:tplc="04090005" w:tentative="1">
+      <w:start w:val="1"/>
+      <w:numFmt w:val="bullet"/>
+      <w:lvlText w:val=""/>
+      <w:lvlJc w:val="left"/>
+      <w:pPr>
+        <w:ind w:left="6480" w:hanging="360"/>
+      </w:pPr>
+      <w:rPr>
+        <w:rFonts w:ascii="Wingdings" w:hAnsi="Wingdings" w:hint="default"/>
+      </w:rPr>
+    </w:lvl>
+  </w:abstractNum>
   <w:num w:numId="1" w16cid:durableId="1834836134">
     <w:abstractNumId w:val="0"/>
+  </w:num>
+  <w:num w:numId="2" w16cid:durableId="2036033985">
+    <w:abstractNumId w:val="1"/>
   </w:num>
 </w:numbering>
 </file>

</xml_diff>